<commit_message>
Workshop-Unterlagen auf 5-Phasen-Modell umgestellt, HSRW-Projektbriefing ergänzt
Design Thinking in fünf Phasen (Empathie, Definieren, Ideen finden,
Prototypen, Testen) statt Double Diamond. Neues Prozess-Schaubild,
Phasen-Navigator, Phasenbezüge in Prompts und Arbeitsheft angepasst.

Co-Authored-By: Claude Opus 5.5 <noreply@anthropic.com>
Claude-Session: https://claude.ai/code/session_01RweZo35imzJcVzaRYvpYGa
</commit_message>
<xml_diff>
--- a/workshop-ki-fuer-kmu/KI-INNOVATION_Arbeitsheft_Remote-Phase.docx
+++ b/workshop-ki-fuer-kmu/KI-INNOVATION_Arbeitsheft_Remote-Phase.docx
@@ -9091,7 +9091,7 @@
           <w:sz w:val="26"/>
           <w:szCs w:val="26"/>
         </w:rPr>
-        <w:t xml:space="preserve">Phase 1 · Verstehen: Challenge-Scout</w:t>
+        <w:t xml:space="preserve">Phase 1 · Empathie: Verstehen: Challenge-Scout</w:t>
       </w:r>
     </w:p>
     <w:p>
@@ -9261,7 +9261,7 @@
                 <w:sz w:val="19"/>
                 <w:szCs w:val="19"/>
               </w:rPr>
-              <w:t xml:space="preserve">Du unterstützt [Unternehmen] aus [Region] in Phase 1 „Verstehen“. Ausgangslage: [Problem in 2–3 Sätzen]. Zielgruppen: [Liste].</w:t>
+              <w:t xml:space="preserve">Du unterstützt [Unternehmen] aus [Region] in Phase 1 „Empathie“, Schritt Verstehen. Ausgangslage: [Problem in 2–3 Sätzen]. Zielgruppen: [Liste].</w:t>
             </w:r>
           </w:p>
         </w:tc>
@@ -9702,7 +9702,7 @@
           <w:sz w:val="26"/>
           <w:szCs w:val="26"/>
         </w:rPr>
-        <w:t xml:space="preserve">Phase 2 · Beobachten: Interview-Coach</w:t>
+        <w:t xml:space="preserve">Phase 1 · Empathie: Beobachten: Interview-Coach</w:t>
       </w:r>
     </w:p>
     <w:p>
@@ -9872,7 +9872,7 @@
                 <w:sz w:val="19"/>
                 <w:szCs w:val="19"/>
               </w:rPr>
-              <w:t xml:space="preserve">Phase 2 „Beobachten“. Unsere Design Challenge: [Challenge]. Zielgruppen: [Liste]. Offene Annahmen aus Phase 1: [Liste].</w:t>
+              <w:t xml:space="preserve">Phase 1 „Empathie“, Schritt Beobachten. Unsere Design Challenge: [Challenge]. Zielgruppen: [Liste]. Offene Annahmen aus der Recherche: [Liste].</w:t>
             </w:r>
           </w:p>
         </w:tc>
@@ -10313,7 +10313,7 @@
           <w:sz w:val="26"/>
           <w:szCs w:val="26"/>
         </w:rPr>
-        <w:t xml:space="preserve">Phase 3 · Sichtweise definieren: Insight-Analyst</w:t>
+        <w:t xml:space="preserve">Phase 2 · Definieren: Insight-Analyst</w:t>
       </w:r>
     </w:p>
     <w:p>
@@ -10483,7 +10483,7 @@
                 <w:sz w:val="19"/>
                 <w:szCs w:val="19"/>
               </w:rPr>
-              <w:t xml:space="preserve">Phase 3 „Sichtweise definieren“. Design Challenge: [Challenge]. Beigefügt: Auswertungstabelle aus [Anzahl] Interviews und Beobachtungen.</w:t>
+              <w:t xml:space="preserve">Phase 2 „Definieren“. Design Challenge: [Challenge]. Beigefügt: Auswertungstabelle aus [Anzahl] Interviews und Beobachtungen.</w:t>
             </w:r>
           </w:p>
         </w:tc>
@@ -10924,7 +10924,7 @@
           <w:sz w:val="26"/>
           <w:szCs w:val="26"/>
         </w:rPr>
-        <w:t xml:space="preserve">Phase 4 · Ideen finden: Ideen-Sparringspartner</w:t>
+        <w:t xml:space="preserve">Phase 3 · Ideen finden: Ideen-Sparringspartner</w:t>
       </w:r>
     </w:p>
     <w:p>
@@ -11094,7 +11094,7 @@
                 <w:sz w:val="19"/>
                 <w:szCs w:val="19"/>
               </w:rPr>
-              <w:t xml:space="preserve">Phase 4 „Ideen finden“. Persona: [Kurzprofil]. Point of View: [Statement]. Unsere Frage: [Wie können wir …?]. Rahmen: [Budget, Zeit].</w:t>
+              <w:t xml:space="preserve">Phase 3 „Ideen finden“. Persona: [Kurzprofil]. Point of View: [Statement]. Unsere Frage: [Wie können wir …?]. Rahmen: [Budget, Zeit].</w:t>
             </w:r>
           </w:p>
         </w:tc>
@@ -11535,7 +11535,7 @@
           <w:sz w:val="26"/>
           <w:szCs w:val="26"/>
         </w:rPr>
-        <w:t xml:space="preserve">Phase 5 · Prototypen: Prototyp-Werkstatt</w:t>
+        <w:t xml:space="preserve">Phase 4 · Prototypen: Prototyp-Werkstatt</w:t>
       </w:r>
     </w:p>
     <w:p>
@@ -11705,7 +11705,7 @@
                 <w:sz w:val="19"/>
                 <w:szCs w:val="19"/>
               </w:rPr>
-              <w:t xml:space="preserve">Phase 5. Ausgewählte Idee: [Idee]. Persona: [Kurzprofil]. Riskanteste Annahme: [Annahme]. Corporate Design: [Farben, Schrift].</w:t>
+              <w:t xml:space="preserve">Phase 4 „Prototypen“. Ausgewählte Idee: [Idee]. Persona: [Kurzprofil]. Riskanteste Annahme: [Annahme]. Corporate Design: [Farben, Schrift].</w:t>
             </w:r>
           </w:p>
         </w:tc>
@@ -12316,7 +12316,7 @@
                 <w:sz w:val="20"/>
                 <w:szCs w:val="20"/>
               </w:rPr>
-              <w:t xml:space="preserve">1 Verstehen</w:t>
+              <w:t xml:space="preserve">1 Empathie: Verstehen</w:t>
             </w:r>
           </w:p>
         </w:tc>
@@ -12708,7 +12708,7 @@
                 <w:sz w:val="20"/>
                 <w:szCs w:val="20"/>
               </w:rPr>
-              <w:t xml:space="preserve">2 Beobachten</w:t>
+              <w:t xml:space="preserve">1 Empathie: Beobachten</w:t>
             </w:r>
           </w:p>
         </w:tc>
@@ -13002,7 +13002,7 @@
                 <w:sz w:val="20"/>
                 <w:szCs w:val="20"/>
               </w:rPr>
-              <w:t xml:space="preserve">3 Sichtweise definieren</w:t>
+              <w:t xml:space="preserve">2 Definieren</w:t>
             </w:r>
           </w:p>
         </w:tc>
@@ -13394,7 +13394,7 @@
                 <w:sz w:val="20"/>
                 <w:szCs w:val="20"/>
               </w:rPr>
-              <w:t xml:space="preserve">4 Ideen finden</w:t>
+              <w:t xml:space="preserve">3 Ideen finden</w:t>
             </w:r>
           </w:p>
         </w:tc>
@@ -13688,7 +13688,7 @@
                 <w:sz w:val="20"/>
                 <w:szCs w:val="20"/>
               </w:rPr>
-              <w:t xml:space="preserve">5 Prototypen</w:t>
+              <w:t xml:space="preserve">4 Prototypen</w:t>
             </w:r>
           </w:p>
         </w:tc>

</xml_diff>